<commit_message>
Revise mathematics control work formatting
Co-authored-by: nektoqqw <nektoqqw@users.noreply.github.com>
</commit_message>
<xml_diff>
--- a/kontrolnaya_rabota_matematika_variant_15.docx
+++ b/kontrolnaya_rabota_matematika_variant_15.docx
@@ -4,12 +4,14 @@
   <w:body>
     <w:p>
       <w:pPr>
-        <w:spacing w:line="360" w:lineRule="auto" w:after="0"/>
+        <w:spacing w:line="360" w:lineRule="auto" w:before="0" w:after="0"/>
         <w:jc w:val="center"/>
       </w:pPr>
       <w:r>
         <w:rPr>
           <w:rFonts w:ascii="Times New Roman" w:hAnsi="Times New Roman" w:eastAsia="Times New Roman"/>
+          <w:b w:val="0"/>
+          <w:i w:val="0"/>
           <w:sz w:val="28"/>
         </w:rPr>
         <w:t>АНО ПО «Колледж предпринимательских и цифровых технологий»</w:t>
@@ -17,37 +19,84 @@
     </w:p>
     <w:p>
       <w:pPr>
-        <w:spacing w:line="360" w:lineRule="auto" w:after="0"/>
-        <w:jc w:val="center"/>
+        <w:spacing w:line="360" w:lineRule="auto" w:before="0" w:after="0"/>
+        <w:jc w:val="left"/>
       </w:pPr>
       <w:r>
         <w:rPr>
           <w:rFonts w:ascii="Times New Roman" w:hAnsi="Times New Roman" w:eastAsia="Times New Roman"/>
+          <w:b w:val="0"/>
+          <w:i w:val="0"/>
           <w:sz w:val="28"/>
         </w:rPr>
       </w:r>
     </w:p>
     <w:p>
       <w:pPr>
-        <w:spacing w:line="360" w:lineRule="auto" w:after="0"/>
-        <w:jc w:val="center"/>
+        <w:spacing w:line="360" w:lineRule="auto" w:before="0" w:after="0"/>
+        <w:jc w:val="left"/>
       </w:pPr>
       <w:r>
         <w:rPr>
           <w:rFonts w:ascii="Times New Roman" w:hAnsi="Times New Roman" w:eastAsia="Times New Roman"/>
+          <w:b w:val="0"/>
+          <w:i w:val="0"/>
           <w:sz w:val="28"/>
         </w:rPr>
       </w:r>
     </w:p>
     <w:p>
       <w:pPr>
-        <w:spacing w:line="360" w:lineRule="auto" w:after="0"/>
-        <w:jc w:val="center"/>
+        <w:spacing w:line="360" w:lineRule="auto" w:before="0" w:after="0"/>
+        <w:jc w:val="left"/>
+      </w:pPr>
+      <w:r>
+        <w:rPr>
+          <w:rFonts w:ascii="Times New Roman" w:hAnsi="Times New Roman" w:eastAsia="Times New Roman"/>
+          <w:b w:val="0"/>
+          <w:i w:val="0"/>
+          <w:sz w:val="28"/>
+        </w:rPr>
+      </w:r>
+    </w:p>
+    <w:p>
+      <w:pPr>
+        <w:spacing w:line="360" w:lineRule="auto" w:before="0" w:after="0"/>
+        <w:jc w:val="left"/>
+      </w:pPr>
+      <w:r>
+        <w:rPr>
+          <w:rFonts w:ascii="Times New Roman" w:hAnsi="Times New Roman" w:eastAsia="Times New Roman"/>
+          <w:b w:val="0"/>
+          <w:i w:val="0"/>
+          <w:sz w:val="28"/>
+        </w:rPr>
+      </w:r>
+    </w:p>
+    <w:p>
+      <w:pPr>
+        <w:spacing w:line="360" w:lineRule="auto" w:before="0" w:after="0"/>
+        <w:jc w:val="left"/>
+      </w:pPr>
+      <w:r>
+        <w:rPr>
+          <w:rFonts w:ascii="Times New Roman" w:hAnsi="Times New Roman" w:eastAsia="Times New Roman"/>
+          <w:b w:val="0"/>
+          <w:i w:val="0"/>
+          <w:sz w:val="28"/>
+        </w:rPr>
+      </w:r>
+    </w:p>
+    <w:p>
+      <w:pPr>
+        <w:spacing w:line="360" w:lineRule="auto" w:before="0" w:after="0"/>
+        <w:jc w:val="left"/>
       </w:pPr>
       <w:r>
         <w:rPr>
           <w:rFonts w:ascii="Times New Roman" w:hAnsi="Times New Roman" w:eastAsia="Times New Roman"/>
           <w:b/>
+          <w:i w:val="0"/>
           <w:sz w:val="28"/>
         </w:rPr>
         <w:t>КОНТРОЛЬНАЯ РАБОТА №</w:t>
@@ -55,37 +104,57 @@
     </w:p>
     <w:p>
       <w:pPr>
-        <w:spacing w:line="360" w:lineRule="auto" w:after="0"/>
+        <w:spacing w:line="360" w:lineRule="auto" w:before="0" w:after="0"/>
         <w:jc w:val="center"/>
       </w:pPr>
       <w:r>
         <w:rPr>
           <w:rFonts w:ascii="Times New Roman" w:hAnsi="Times New Roman" w:eastAsia="Times New Roman"/>
+          <w:b/>
+          <w:i w:val="0"/>
           <w:sz w:val="28"/>
         </w:rPr>
-        <w:t>ПО ДИСЦИПЛИНЕ             МАТЕМАТИКА</w:t>
+        <w:t>ПО ДИСЦИПЛИНЕ             ______________________________</w:t>
       </w:r>
     </w:p>
     <w:p>
       <w:pPr>
-        <w:spacing w:line="360" w:lineRule="auto" w:after="0"/>
-        <w:jc w:val="center"/>
+        <w:spacing w:line="360" w:lineRule="auto" w:before="0" w:after="0"/>
+        <w:jc w:val="left"/>
       </w:pPr>
       <w:r>
         <w:rPr>
           <w:rFonts w:ascii="Times New Roman" w:hAnsi="Times New Roman" w:eastAsia="Times New Roman"/>
+          <w:b w:val="0"/>
+          <w:i w:val="0"/>
           <w:sz w:val="28"/>
         </w:rPr>
       </w:r>
     </w:p>
     <w:p>
       <w:pPr>
-        <w:spacing w:line="360" w:lineRule="auto" w:after="0"/>
-        <w:jc w:val="center"/>
+        <w:spacing w:line="360" w:lineRule="auto" w:before="0" w:after="0"/>
+        <w:jc w:val="left"/>
       </w:pPr>
       <w:r>
         <w:rPr>
           <w:rFonts w:ascii="Times New Roman" w:hAnsi="Times New Roman" w:eastAsia="Times New Roman"/>
+          <w:b w:val="0"/>
+          <w:i w:val="0"/>
+          <w:sz w:val="28"/>
+        </w:rPr>
+      </w:r>
+    </w:p>
+    <w:p>
+      <w:pPr>
+        <w:spacing w:line="360" w:lineRule="auto" w:before="0" w:after="0"/>
+        <w:jc w:val="right"/>
+      </w:pPr>
+      <w:r>
+        <w:rPr>
+          <w:rFonts w:ascii="Times New Roman" w:hAnsi="Times New Roman" w:eastAsia="Times New Roman"/>
+          <w:b w:val="0"/>
+          <w:i w:val="0"/>
           <w:sz w:val="28"/>
         </w:rPr>
         <w:t>ВАРИАНТ    15</w:t>
@@ -93,12 +162,14 @@
     </w:p>
     <w:p>
       <w:pPr>
-        <w:spacing w:line="360" w:lineRule="auto" w:after="0"/>
-        <w:jc w:val="center"/>
+        <w:spacing w:line="360" w:lineRule="auto" w:before="0" w:after="0"/>
+        <w:jc w:val="right"/>
       </w:pPr>
       <w:r>
         <w:rPr>
           <w:rFonts w:ascii="Times New Roman" w:hAnsi="Times New Roman" w:eastAsia="Times New Roman"/>
+          <w:b w:val="0"/>
+          <w:i w:val="0"/>
           <w:sz w:val="28"/>
         </w:rPr>
         <w:t>ШИФР        15</w:t>
@@ -106,24 +177,42 @@
     </w:p>
     <w:p>
       <w:pPr>
-        <w:spacing w:line="360" w:lineRule="auto" w:after="0"/>
-        <w:jc w:val="center"/>
+        <w:spacing w:line="360" w:lineRule="auto" w:before="0" w:after="0"/>
+        <w:jc w:val="left"/>
       </w:pPr>
       <w:r>
         <w:rPr>
           <w:rFonts w:ascii="Times New Roman" w:hAnsi="Times New Roman" w:eastAsia="Times New Roman"/>
+          <w:b w:val="0"/>
+          <w:i w:val="0"/>
           <w:sz w:val="28"/>
         </w:rPr>
       </w:r>
     </w:p>
     <w:p>
       <w:pPr>
-        <w:spacing w:line="360" w:lineRule="auto" w:after="0"/>
-        <w:jc w:val="center"/>
+        <w:spacing w:line="360" w:lineRule="auto" w:before="0" w:after="0"/>
+        <w:jc w:val="left"/>
       </w:pPr>
       <w:r>
         <w:rPr>
           <w:rFonts w:ascii="Times New Roman" w:hAnsi="Times New Roman" w:eastAsia="Times New Roman"/>
+          <w:b w:val="0"/>
+          <w:i w:val="0"/>
+          <w:sz w:val="28"/>
+        </w:rPr>
+      </w:r>
+    </w:p>
+    <w:p>
+      <w:pPr>
+        <w:spacing w:line="360" w:lineRule="auto" w:before="0" w:after="0"/>
+        <w:jc w:val="right"/>
+      </w:pPr>
+      <w:r>
+        <w:rPr>
+          <w:rFonts w:ascii="Times New Roman" w:hAnsi="Times New Roman" w:eastAsia="Times New Roman"/>
+          <w:b w:val="0"/>
+          <w:i w:val="0"/>
           <w:sz w:val="28"/>
         </w:rPr>
         <w:t>РАБОТА ПОСТУПИЛА НА ЗАОЧНОЕ ОТДЕЛЕНИЕ</w:t>
@@ -131,12 +220,14 @@
     </w:p>
     <w:p>
       <w:pPr>
-        <w:spacing w:line="360" w:lineRule="auto" w:after="0"/>
-        <w:jc w:val="center"/>
+        <w:spacing w:line="360" w:lineRule="auto" w:before="0" w:after="0"/>
+        <w:jc w:val="right"/>
       </w:pPr>
       <w:r>
         <w:rPr>
           <w:rFonts w:ascii="Times New Roman" w:hAnsi="Times New Roman" w:eastAsia="Times New Roman"/>
+          <w:b w:val="0"/>
+          <w:i w:val="0"/>
           <w:sz w:val="28"/>
         </w:rPr>
         <w:t>«____»________________ 20___ Г.</w:t>
@@ -144,12 +235,14 @@
     </w:p>
     <w:p>
       <w:pPr>
-        <w:spacing w:line="360" w:lineRule="auto" w:after="0"/>
-        <w:jc w:val="center"/>
+        <w:spacing w:line="360" w:lineRule="auto" w:before="0" w:after="0"/>
+        <w:jc w:val="right"/>
       </w:pPr>
       <w:r>
         <w:rPr>
           <w:rFonts w:ascii="Times New Roman" w:hAnsi="Times New Roman" w:eastAsia="Times New Roman"/>
+          <w:b w:val="0"/>
+          <w:i w:val="0"/>
           <w:sz w:val="28"/>
         </w:rPr>
         <w:t>ДАТА РЕЦЕНЗИИ «____» _____ 20___ Г.</w:t>
@@ -157,12 +250,14 @@
     </w:p>
     <w:p>
       <w:pPr>
-        <w:spacing w:line="360" w:lineRule="auto" w:after="0"/>
-        <w:jc w:val="center"/>
+        <w:spacing w:line="360" w:lineRule="auto" w:before="0" w:after="0"/>
+        <w:jc w:val="right"/>
       </w:pPr>
       <w:r>
         <w:rPr>
           <w:rFonts w:ascii="Times New Roman" w:hAnsi="Times New Roman" w:eastAsia="Times New Roman"/>
+          <w:b w:val="0"/>
+          <w:i w:val="0"/>
           <w:sz w:val="28"/>
         </w:rPr>
         <w:t>ОЦЕНКА ______________________</w:t>
@@ -170,24 +265,28 @@
     </w:p>
     <w:p>
       <w:pPr>
-        <w:spacing w:line="360" w:lineRule="auto" w:after="0"/>
-        <w:jc w:val="center"/>
+        <w:spacing w:line="360" w:lineRule="auto" w:before="0" w:after="0"/>
+        <w:jc w:val="right"/>
       </w:pPr>
       <w:r>
         <w:rPr>
           <w:rFonts w:ascii="Times New Roman" w:hAnsi="Times New Roman" w:eastAsia="Times New Roman"/>
+          <w:b w:val="0"/>
+          <w:i w:val="0"/>
           <w:sz w:val="28"/>
         </w:rPr>
       </w:r>
     </w:p>
     <w:p>
       <w:pPr>
-        <w:spacing w:line="360" w:lineRule="auto" w:after="0"/>
-        <w:jc w:val="center"/>
+        <w:spacing w:line="360" w:lineRule="auto" w:before="0" w:after="0"/>
+        <w:jc w:val="right"/>
       </w:pPr>
       <w:r>
         <w:rPr>
           <w:rFonts w:ascii="Times New Roman" w:hAnsi="Times New Roman" w:eastAsia="Times New Roman"/>
+          <w:b w:val="0"/>
+          <w:i w:val="0"/>
           <w:sz w:val="28"/>
         </w:rPr>
         <w:t>ВЫПОЛНИЛ: ОБУЧАЮЩИЙСЯ ГРУППЫ</w:t>
@@ -195,12 +294,14 @@
     </w:p>
     <w:p>
       <w:pPr>
-        <w:spacing w:line="360" w:lineRule="auto" w:after="0"/>
-        <w:jc w:val="center"/>
+        <w:spacing w:line="360" w:lineRule="auto" w:before="0" w:after="0"/>
+        <w:jc w:val="right"/>
       </w:pPr>
       <w:r>
         <w:rPr>
           <w:rFonts w:ascii="Times New Roman" w:hAnsi="Times New Roman" w:eastAsia="Times New Roman"/>
+          <w:b w:val="0"/>
+          <w:i w:val="0"/>
           <w:sz w:val="28"/>
         </w:rPr>
         <w:t>ВЕБ-251З   СПЕЦИАЛЬНОСТИ</w:t>
@@ -208,12 +309,14 @@
     </w:p>
     <w:p>
       <w:pPr>
-        <w:spacing w:line="360" w:lineRule="auto" w:after="0"/>
-        <w:jc w:val="center"/>
+        <w:spacing w:line="360" w:lineRule="auto" w:before="0" w:after="0"/>
+        <w:jc w:val="right"/>
       </w:pPr>
       <w:r>
         <w:rPr>
           <w:rFonts w:ascii="Times New Roman" w:hAnsi="Times New Roman" w:eastAsia="Times New Roman"/>
+          <w:b w:val="0"/>
+          <w:i w:val="0"/>
           <w:sz w:val="28"/>
         </w:rPr>
         <w:t>ФИО   Назаров</w:t>
@@ -221,12 +324,14 @@
     </w:p>
     <w:p>
       <w:pPr>
-        <w:spacing w:line="360" w:lineRule="auto" w:after="0"/>
-        <w:jc w:val="center"/>
+        <w:spacing w:line="360" w:lineRule="auto" w:before="0" w:after="0"/>
+        <w:jc w:val="right"/>
       </w:pPr>
       <w:r>
         <w:rPr>
           <w:rFonts w:ascii="Times New Roman" w:hAnsi="Times New Roman" w:eastAsia="Times New Roman"/>
+          <w:b w:val="0"/>
+          <w:i w:val="0"/>
           <w:sz w:val="28"/>
         </w:rPr>
         <w:t>Иван Александрович</w:t>
@@ -234,24 +339,28 @@
     </w:p>
     <w:p>
       <w:pPr>
-        <w:spacing w:line="360" w:lineRule="auto" w:after="0"/>
-        <w:jc w:val="center"/>
+        <w:spacing w:line="360" w:lineRule="auto" w:before="0" w:after="0"/>
+        <w:jc w:val="right"/>
       </w:pPr>
       <w:r>
         <w:rPr>
           <w:rFonts w:ascii="Times New Roman" w:hAnsi="Times New Roman" w:eastAsia="Times New Roman"/>
+          <w:b w:val="0"/>
+          <w:i w:val="0"/>
           <w:sz w:val="28"/>
         </w:rPr>
       </w:r>
     </w:p>
     <w:p>
       <w:pPr>
-        <w:spacing w:line="360" w:lineRule="auto" w:after="0"/>
-        <w:jc w:val="center"/>
+        <w:spacing w:line="360" w:lineRule="auto" w:before="0" w:after="0"/>
+        <w:jc w:val="right"/>
       </w:pPr>
       <w:r>
         <w:rPr>
           <w:rFonts w:ascii="Times New Roman" w:hAnsi="Times New Roman" w:eastAsia="Times New Roman"/>
+          <w:b w:val="0"/>
+          <w:i w:val="0"/>
           <w:sz w:val="28"/>
         </w:rPr>
         <w:t>ПРОВЕРИЛ ПРЕПОДАВАТЕЛЬ:</w:t>
@@ -259,48 +368,70 @@
     </w:p>
     <w:p>
       <w:pPr>
-        <w:spacing w:line="360" w:lineRule="auto" w:after="0"/>
-        <w:jc w:val="center"/>
+        <w:spacing w:line="360" w:lineRule="auto" w:before="0" w:after="0"/>
+        <w:jc w:val="left"/>
       </w:pPr>
       <w:r>
         <w:rPr>
           <w:rFonts w:ascii="Times New Roman" w:hAnsi="Times New Roman" w:eastAsia="Times New Roman"/>
+          <w:b w:val="0"/>
+          <w:i w:val="0"/>
           <w:sz w:val="28"/>
         </w:rPr>
       </w:r>
     </w:p>
     <w:p>
       <w:pPr>
-        <w:spacing w:line="360" w:lineRule="auto" w:after="0"/>
-        <w:jc w:val="center"/>
+        <w:spacing w:line="360" w:lineRule="auto" w:before="0" w:after="0"/>
+        <w:jc w:val="left"/>
       </w:pPr>
       <w:r>
         <w:rPr>
           <w:rFonts w:ascii="Times New Roman" w:hAnsi="Times New Roman" w:eastAsia="Times New Roman"/>
+          <w:b w:val="0"/>
+          <w:i w:val="0"/>
           <w:sz w:val="28"/>
         </w:rPr>
       </w:r>
     </w:p>
     <w:p>
       <w:pPr>
-        <w:spacing w:line="360" w:lineRule="auto" w:after="0"/>
-        <w:jc w:val="center"/>
+        <w:spacing w:line="360" w:lineRule="auto" w:before="0" w:after="0"/>
+        <w:jc w:val="left"/>
       </w:pPr>
       <w:r>
         <w:rPr>
           <w:rFonts w:ascii="Times New Roman" w:hAnsi="Times New Roman" w:eastAsia="Times New Roman"/>
+          <w:b w:val="0"/>
+          <w:i w:val="0"/>
           <w:sz w:val="28"/>
         </w:rPr>
       </w:r>
     </w:p>
     <w:p>
       <w:pPr>
-        <w:spacing w:line="360" w:lineRule="auto" w:after="0"/>
-        <w:jc w:val="center"/>
+        <w:spacing w:line="360" w:lineRule="auto" w:before="0" w:after="0"/>
+        <w:jc w:val="left"/>
       </w:pPr>
       <w:r>
         <w:rPr>
           <w:rFonts w:ascii="Times New Roman" w:hAnsi="Times New Roman" w:eastAsia="Times New Roman"/>
+          <w:b w:val="0"/>
+          <w:i w:val="0"/>
+          <w:sz w:val="28"/>
+        </w:rPr>
+      </w:r>
+    </w:p>
+    <w:p>
+      <w:pPr>
+        <w:spacing w:line="360" w:lineRule="auto" w:before="0" w:after="0"/>
+        <w:jc w:val="left"/>
+      </w:pPr>
+      <w:r>
+        <w:rPr>
+          <w:rFonts w:ascii="Times New Roman" w:hAnsi="Times New Roman" w:eastAsia="Times New Roman"/>
+          <w:b w:val="0"/>
+          <w:i w:val="0"/>
           <w:sz w:val="28"/>
         </w:rPr>
         <w:t>Кемерово, 2026 г.</w:t>
@@ -317,7 +448,7 @@
     </w:p>
     <w:p>
       <w:pPr>
-        <w:spacing w:line="360" w:lineRule="auto" w:after="120"/>
+        <w:spacing w:line="360" w:lineRule="auto" w:before="120" w:after="120"/>
         <w:jc w:val="center"/>
       </w:pPr>
       <w:r>
@@ -327,12 +458,12 @@
           <w:i/>
           <w:sz w:val="28"/>
         </w:rPr>
-        <w:t>ЗАДАНИЕ: 15, 115, 216</w:t>
+        <w:t>ЗАДАНИЕ 15</w:t>
       </w:r>
     </w:p>
     <w:p>
       <w:pPr>
-        <w:spacing w:line="360" w:lineRule="auto" w:after="0"/>
+        <w:spacing w:line="360" w:lineRule="auto" w:before="0" w:after="0"/>
       </w:pPr>
       <w:r>
         <w:rPr>
@@ -341,12 +472,13 @@
           <w:i/>
           <w:sz w:val="28"/>
         </w:rPr>
-        <w:t>15. Понятие логарифма числа. Основное логарифмическое тождество.</w:t>
+        <w:t>Понятие логарифма числа. Основное логарифмическое тождество.</w:t>
       </w:r>
     </w:p>
     <w:p>
       <w:pPr>
-        <w:spacing w:line="360" w:lineRule="auto" w:after="0"/>
+        <w:spacing w:line="360" w:lineRule="auto" w:before="120" w:after="120"/>
+        <w:jc w:val="center"/>
       </w:pPr>
       <w:r>
         <w:rPr>
@@ -355,13 +487,306 @@
           <w:i/>
           <w:sz w:val="28"/>
         </w:rPr>
-        <w:t>115. Вычислить предел функции.</w:t>
+        <w:t>РЕШЕНИЕ</w:t>
       </w:r>
     </w:p>
     <w:p>
       <w:pPr>
-        <w:spacing w:line="360" w:lineRule="auto"/>
+        <w:spacing w:line="360" w:lineRule="auto" w:before="0" w:after="0"/>
         <w:ind w:firstLine="709"/>
+      </w:pPr>
+      <w:r>
+        <w:rPr>
+          <w:rFonts w:ascii="Times New Roman" w:hAnsi="Times New Roman" w:eastAsia="Times New Roman"/>
+          <w:b w:val="0"/>
+          <w:i w:val="0"/>
+          <w:sz w:val="28"/>
+        </w:rPr>
+        <w:t>Логарифм является одним из основных понятий алгебры и начал математического анализа. Он вводится как операция, обратная возведению в степень. Если известно основание степени и результат возведения в степень, то логарифм позволяет найти сам показатель степени.</w:t>
+      </w:r>
+    </w:p>
+    <w:p>
+      <w:pPr>
+        <w:spacing w:line="360" w:lineRule="auto" w:before="60" w:after="60"/>
+        <w:jc w:val="center"/>
+      </w:pPr>
+      <w:r>
+        <w:rPr>
+          <w:rFonts w:ascii="Times New Roman" w:hAnsi="Times New Roman" w:eastAsia="Times New Roman"/>
+          <w:b w:val="0"/>
+          <w:i w:val="0"/>
+          <w:sz w:val="28"/>
+        </w:rPr>
+        <w:t>logₐb = x  ⇔  aˣ = b</w:t>
+      </w:r>
+    </w:p>
+    <w:p>
+      <w:pPr>
+        <w:spacing w:line="360" w:lineRule="auto" w:before="0" w:after="0"/>
+        <w:ind w:firstLine="709"/>
+      </w:pPr>
+      <w:r>
+        <w:rPr>
+          <w:rFonts w:ascii="Times New Roman" w:hAnsi="Times New Roman" w:eastAsia="Times New Roman"/>
+          <w:b w:val="0"/>
+          <w:i w:val="0"/>
+          <w:sz w:val="28"/>
+        </w:rPr>
+        <w:t>В этом равенстве число a называется основанием логарифма, число b — подлогарифмическим выражением, а x — значением логарифма. По определению логарифма обязательно выполняются условия: a &gt; 0, a ≠ 1, b &gt; 0.</w:t>
+      </w:r>
+    </w:p>
+    <w:p>
+      <w:pPr>
+        <w:spacing w:line="360" w:lineRule="auto" w:before="0" w:after="0"/>
+        <w:ind w:firstLine="709"/>
+      </w:pPr>
+      <w:r>
+        <w:rPr>
+          <w:rFonts w:ascii="Times New Roman" w:hAnsi="Times New Roman" w:eastAsia="Times New Roman"/>
+          <w:b w:val="0"/>
+          <w:i w:val="0"/>
+          <w:sz w:val="28"/>
+        </w:rPr>
+        <w:t>Ограничения на основание и подлогарифмическое выражение важны. Основание a не может быть отрицательным или равным нулю, потому что в школьном курсе степени с произвольными действительными показателями рассматриваются только для положительных оснований. Основание также не может быть равно единице, так как 1 в любой степени равно 1, и обратная операция не была бы однозначной.</w:t>
+      </w:r>
+    </w:p>
+    <w:p>
+      <w:pPr>
+        <w:spacing w:line="360" w:lineRule="auto" w:before="0" w:after="0"/>
+        <w:ind w:firstLine="709"/>
+      </w:pPr>
+      <w:r>
+        <w:rPr>
+          <w:rFonts w:ascii="Times New Roman" w:hAnsi="Times New Roman" w:eastAsia="Times New Roman"/>
+          <w:b w:val="0"/>
+          <w:i w:val="0"/>
+          <w:sz w:val="28"/>
+        </w:rPr>
+        <w:t>Подлогарифмическое выражение b должно быть положительным, потому что положительное основание при возведении в любую действительную степень дает положительное значение. Поэтому выражения вида logₐ0 и logₐ(−b) в действительных числах не имеют смысла.</w:t>
+      </w:r>
+    </w:p>
+    <w:p>
+      <w:pPr>
+        <w:spacing w:line="360" w:lineRule="auto" w:before="0" w:after="0"/>
+        <w:ind w:firstLine="709"/>
+      </w:pPr>
+      <w:r>
+        <w:rPr>
+          <w:rFonts w:ascii="Times New Roman" w:hAnsi="Times New Roman" w:eastAsia="Times New Roman"/>
+          <w:b w:val="0"/>
+          <w:i w:val="0"/>
+          <w:sz w:val="28"/>
+        </w:rPr>
+        <w:t>Основное логарифмическое тождество записывается так:</w:t>
+      </w:r>
+    </w:p>
+    <w:p>
+      <w:pPr>
+        <w:spacing w:line="360" w:lineRule="auto" w:before="60" w:after="60"/>
+        <w:jc w:val="center"/>
+      </w:pPr>
+      <w:r>
+        <w:rPr>
+          <w:rFonts w:ascii="Times New Roman" w:hAnsi="Times New Roman" w:eastAsia="Times New Roman"/>
+          <w:b w:val="0"/>
+          <w:i w:val="0"/>
+          <w:sz w:val="28"/>
+        </w:rPr>
+        <w:t>a^(logₐb) = b,   где a &gt; 0, a ≠ 1, b &gt; 0.</w:t>
+      </w:r>
+    </w:p>
+    <w:p>
+      <w:pPr>
+        <w:spacing w:line="360" w:lineRule="auto" w:before="0" w:after="0"/>
+        <w:ind w:firstLine="709"/>
+      </w:pPr>
+      <w:r>
+        <w:rPr>
+          <w:rFonts w:ascii="Times New Roman" w:hAnsi="Times New Roman" w:eastAsia="Times New Roman"/>
+          <w:b w:val="0"/>
+          <w:i w:val="0"/>
+          <w:sz w:val="28"/>
+        </w:rPr>
+        <w:t>Это тождество прямо следует из определения логарифма. Если logₐb = x, то по определению aˣ = b. Подставляя вместо x выражение logₐb, получаем a^(logₐb) = b.</w:t>
+      </w:r>
+    </w:p>
+    <w:p>
+      <w:pPr>
+        <w:spacing w:line="360" w:lineRule="auto" w:before="0" w:after="0"/>
+        <w:ind w:firstLine="709"/>
+      </w:pPr>
+      <w:r>
+        <w:rPr>
+          <w:rFonts w:ascii="Times New Roman" w:hAnsi="Times New Roman" w:eastAsia="Times New Roman"/>
+          <w:b w:val="0"/>
+          <w:i w:val="0"/>
+          <w:sz w:val="28"/>
+        </w:rPr>
+        <w:t>Из определения логарифма также следуют частные свойства, которые часто используются при вычислениях и преобразованиях:</w:t>
+      </w:r>
+    </w:p>
+    <w:p>
+      <w:pPr>
+        <w:spacing w:line="360" w:lineRule="auto" w:before="0" w:after="0"/>
+        <w:ind w:left="709"/>
+      </w:pPr>
+      <w:r>
+        <w:rPr>
+          <w:rFonts w:ascii="Times New Roman" w:hAnsi="Times New Roman" w:eastAsia="Times New Roman"/>
+          <w:b w:val="0"/>
+          <w:i w:val="0"/>
+          <w:sz w:val="28"/>
+        </w:rPr>
+        <w:t>logₐ1 = 0, потому что a⁰ = 1;</w:t>
+      </w:r>
+    </w:p>
+    <w:p>
+      <w:pPr>
+        <w:spacing w:line="360" w:lineRule="auto" w:before="0" w:after="0"/>
+        <w:ind w:left="709"/>
+      </w:pPr>
+      <w:r>
+        <w:rPr>
+          <w:rFonts w:ascii="Times New Roman" w:hAnsi="Times New Roman" w:eastAsia="Times New Roman"/>
+          <w:b w:val="0"/>
+          <w:i w:val="0"/>
+          <w:sz w:val="28"/>
+        </w:rPr>
+        <w:t>logₐa = 1, потому что a¹ = a;</w:t>
+      </w:r>
+    </w:p>
+    <w:p>
+      <w:pPr>
+        <w:spacing w:line="360" w:lineRule="auto" w:before="0" w:after="0"/>
+        <w:ind w:left="709"/>
+      </w:pPr>
+      <w:r>
+        <w:rPr>
+          <w:rFonts w:ascii="Times New Roman" w:hAnsi="Times New Roman" w:eastAsia="Times New Roman"/>
+          <w:b w:val="0"/>
+          <w:i w:val="0"/>
+          <w:sz w:val="28"/>
+        </w:rPr>
+        <w:t>logₐ(aⁿ) = n;</w:t>
+      </w:r>
+    </w:p>
+    <w:p>
+      <w:pPr>
+        <w:spacing w:line="360" w:lineRule="auto" w:before="0" w:after="0"/>
+        <w:ind w:left="709"/>
+      </w:pPr>
+      <w:r>
+        <w:rPr>
+          <w:rFonts w:ascii="Times New Roman" w:hAnsi="Times New Roman" w:eastAsia="Times New Roman"/>
+          <w:b w:val="0"/>
+          <w:i w:val="0"/>
+          <w:sz w:val="28"/>
+        </w:rPr>
+        <w:t>a^(logₐb) = b.</w:t>
+      </w:r>
+    </w:p>
+    <w:p>
+      <w:pPr>
+        <w:spacing w:line="360" w:lineRule="auto" w:before="0" w:after="0"/>
+        <w:ind w:firstLine="709"/>
+      </w:pPr>
+      <w:r>
+        <w:rPr>
+          <w:rFonts w:ascii="Times New Roman" w:hAnsi="Times New Roman" w:eastAsia="Times New Roman"/>
+          <w:b w:val="0"/>
+          <w:i w:val="0"/>
+          <w:sz w:val="28"/>
+        </w:rPr>
+        <w:t>Рассмотрим несколько примеров. Значение log₂8 равно 3, так как 2³ = 8. Значение log₃81 равно 4, так как 3⁴ = 81. Значение log₁₀1000 равно 3, потому что 10³ = 1000.</w:t>
+      </w:r>
+    </w:p>
+    <w:p>
+      <w:pPr>
+        <w:spacing w:line="360" w:lineRule="auto" w:before="0" w:after="0"/>
+        <w:ind w:firstLine="709"/>
+      </w:pPr>
+      <w:r>
+        <w:rPr>
+          <w:rFonts w:ascii="Times New Roman" w:hAnsi="Times New Roman" w:eastAsia="Times New Roman"/>
+          <w:b w:val="0"/>
+          <w:i w:val="0"/>
+          <w:sz w:val="28"/>
+        </w:rPr>
+        <w:t>Логарифмы применяются при решении показательных и логарифмических уравнений, при преобразовании выражений, в задачах на проценты, рост величин, вычисление сложных зависимостей. Натуральные логарифмы имеют основание e и записываются ln x, а десятичные логарифмы имеют основание 10 и записываются lg x.</w:t>
+      </w:r>
+    </w:p>
+    <w:p>
+      <w:pPr>
+        <w:spacing w:line="360" w:lineRule="auto" w:before="0" w:after="0"/>
+        <w:ind w:firstLine="709"/>
+      </w:pPr>
+      <w:r>
+        <w:rPr>
+          <w:rFonts w:ascii="Times New Roman" w:hAnsi="Times New Roman" w:eastAsia="Times New Roman"/>
+          <w:b w:val="0"/>
+          <w:i w:val="0"/>
+          <w:sz w:val="28"/>
+        </w:rPr>
+        <w:t>При решении логарифмических уравнений сначала записывают область допустимых значений: все подлогарифмические выражения должны быть положительными, а основания — положительными и не равными единице. После решения уравнения найденные корни обязательно проверяют по области допустимых значений.</w:t>
+      </w:r>
+    </w:p>
+    <w:p>
+      <w:pPr>
+        <w:spacing w:line="360" w:lineRule="auto" w:before="0" w:after="0"/>
+        <w:ind w:firstLine="709"/>
+      </w:pPr>
+      <w:r>
+        <w:rPr>
+          <w:rFonts w:ascii="Times New Roman" w:hAnsi="Times New Roman" w:eastAsia="Times New Roman"/>
+          <w:b w:val="0"/>
+          <w:i w:val="0"/>
+          <w:sz w:val="28"/>
+        </w:rPr>
+        <w:t>Вывод: логарифм числа b по основанию a — это показатель степени, в которую надо возвести основание a, чтобы получить число b. Основное логарифмическое тождество a^(logₐb) = b выражает связь между логарифмированием и возведением в степень.</w:t>
+      </w:r>
+    </w:p>
+    <w:p>
+      <w:r>
+        <w:rPr>
+          <w:rFonts w:ascii="Times New Roman" w:hAnsi="Times New Roman" w:eastAsia="Times New Roman"/>
+          <w:sz w:val="28"/>
+        </w:rPr>
+        <w:br w:type="page"/>
+      </w:r>
+    </w:p>
+    <w:p>
+      <w:pPr>
+        <w:spacing w:line="360" w:lineRule="auto" w:before="120" w:after="120"/>
+        <w:jc w:val="center"/>
+      </w:pPr>
+      <w:r>
+        <w:rPr>
+          <w:rFonts w:ascii="Times New Roman" w:hAnsi="Times New Roman" w:eastAsia="Times New Roman"/>
+          <w:b/>
+          <w:i/>
+          <w:sz w:val="28"/>
+        </w:rPr>
+        <w:t>ЗАДАНИЕ 115</w:t>
+      </w:r>
+    </w:p>
+    <w:p>
+      <w:pPr>
+        <w:spacing w:line="360" w:lineRule="auto" w:before="0" w:after="0"/>
+      </w:pPr>
+      <w:r>
+        <w:rPr>
+          <w:rFonts w:ascii="Times New Roman" w:hAnsi="Times New Roman" w:eastAsia="Times New Roman"/>
+          <w:b/>
+          <w:i/>
+          <w:sz w:val="28"/>
+        </w:rPr>
+        <w:t>Вычислить предел функции.</w:t>
+      </w:r>
+    </w:p>
+    <w:p>
+      <w:pPr>
+        <w:spacing w:line="360" w:lineRule="auto" w:after="120"/>
+        <w:jc w:val="center"/>
       </w:pPr>
       <w:r>
         <w:rPr>
@@ -370,7 +795,7 @@
         </w:rPr>
         <w:drawing>
           <wp:inline xmlns:a="http://schemas.openxmlformats.org/drawingml/2006/main" xmlns:pic="http://schemas.openxmlformats.org/drawingml/2006/picture">
-            <wp:extent cx="2194560" cy="438912"/>
+            <wp:extent cx="2926080" cy="585216"/>
             <wp:docPr id="1" name="Picture 1"/>
             <wp:cNvGraphicFramePr>
               <a:graphicFrameLocks noChangeAspect="1"/>
@@ -391,7 +816,7 @@
                   <pic:spPr>
                     <a:xfrm>
                       <a:off x="0" y="0"/>
-                      <a:ext cx="2194560" cy="438912"/>
+                      <a:ext cx="2926080" cy="585216"/>
                     </a:xfrm>
                     <a:prstGeom prst="rect"/>
                   </pic:spPr>
@@ -404,7 +829,8 @@
     </w:p>
     <w:p>
       <w:pPr>
-        <w:spacing w:line="360" w:lineRule="auto" w:after="0"/>
+        <w:spacing w:line="360" w:lineRule="auto" w:before="120" w:after="120"/>
+        <w:jc w:val="center"/>
       </w:pPr>
       <w:r>
         <w:rPr>
@@ -413,13 +839,306 @@
           <w:i/>
           <w:sz w:val="28"/>
         </w:rPr>
-        <w:t>216. Решить уравнение.</w:t>
+        <w:t>РЕШЕНИЕ</w:t>
       </w:r>
     </w:p>
     <w:p>
       <w:pPr>
-        <w:spacing w:line="360" w:lineRule="auto"/>
+        <w:spacing w:line="360" w:lineRule="auto" w:before="0" w:after="0"/>
         <w:ind w:firstLine="709"/>
+      </w:pPr>
+      <w:r>
+        <w:rPr>
+          <w:rFonts w:ascii="Times New Roman" w:hAnsi="Times New Roman" w:eastAsia="Times New Roman"/>
+          <w:b w:val="0"/>
+          <w:i w:val="0"/>
+          <w:sz w:val="28"/>
+        </w:rPr>
+        <w:t>Дан предел рациональной функции при x, стремящемся к бесконечности:</w:t>
+      </w:r>
+    </w:p>
+    <w:p>
+      <w:pPr>
+        <w:spacing w:line="360" w:lineRule="auto" w:before="60" w:after="60"/>
+        <w:jc w:val="center"/>
+      </w:pPr>
+      <w:r>
+        <w:rPr>
+          <w:rFonts w:ascii="Times New Roman" w:hAnsi="Times New Roman" w:eastAsia="Times New Roman"/>
+          <w:b w:val="0"/>
+          <w:i w:val="0"/>
+          <w:sz w:val="28"/>
+        </w:rPr>
+        <w:t>limₓ→∞ (2x⁸ − 3x⁴ − 5x² + 2) / (3x⁷ + 6x⁵ + 4x³ − 3x).</w:t>
+      </w:r>
+    </w:p>
+    <w:p>
+      <w:pPr>
+        <w:spacing w:line="360" w:lineRule="auto" w:before="0" w:after="0"/>
+        <w:ind w:firstLine="709"/>
+      </w:pPr>
+      <w:r>
+        <w:rPr>
+          <w:rFonts w:ascii="Times New Roman" w:hAnsi="Times New Roman" w:eastAsia="Times New Roman"/>
+          <w:b w:val="0"/>
+          <w:i w:val="0"/>
+          <w:sz w:val="28"/>
+        </w:rPr>
+        <w:t>Для вычисления предела рациональной функции при бесконечности нужно сравнить старшие степени многочленов в числителе и знаменателе. В числителе наибольшая степень равна 8, а в знаменателе наибольшая степень равна 7.</w:t>
+      </w:r>
+    </w:p>
+    <w:p>
+      <w:pPr>
+        <w:spacing w:line="360" w:lineRule="auto" w:before="0" w:after="0"/>
+        <w:ind w:firstLine="709"/>
+      </w:pPr>
+      <w:r>
+        <w:rPr>
+          <w:rFonts w:ascii="Times New Roman" w:hAnsi="Times New Roman" w:eastAsia="Times New Roman"/>
+          <w:b w:val="0"/>
+          <w:i w:val="0"/>
+          <w:sz w:val="28"/>
+        </w:rPr>
+        <w:t>Главные члены многочленов:</w:t>
+      </w:r>
+    </w:p>
+    <w:p>
+      <w:pPr>
+        <w:spacing w:line="360" w:lineRule="auto" w:before="60" w:after="60"/>
+        <w:jc w:val="center"/>
+      </w:pPr>
+      <w:r>
+        <w:rPr>
+          <w:rFonts w:ascii="Times New Roman" w:hAnsi="Times New Roman" w:eastAsia="Times New Roman"/>
+          <w:b w:val="0"/>
+          <w:i w:val="0"/>
+          <w:sz w:val="28"/>
+        </w:rPr>
+        <w:t>2x⁸  и  3x⁷.</w:t>
+      </w:r>
+    </w:p>
+    <w:p>
+      <w:pPr>
+        <w:spacing w:line="360" w:lineRule="auto" w:before="0" w:after="0"/>
+        <w:ind w:firstLine="709"/>
+      </w:pPr>
+      <w:r>
+        <w:rPr>
+          <w:rFonts w:ascii="Times New Roman" w:hAnsi="Times New Roman" w:eastAsia="Times New Roman"/>
+          <w:b w:val="0"/>
+          <w:i w:val="0"/>
+          <w:sz w:val="28"/>
+        </w:rPr>
+        <w:t>При больших значениях x именно эти члены определяют поведение всей дроби, потому что остальные слагаемые имеют меньшие степени и становятся несущественными по сравнению со старшими степенями.</w:t>
+      </w:r>
+    </w:p>
+    <w:p>
+      <w:pPr>
+        <w:spacing w:line="360" w:lineRule="auto" w:before="0" w:after="0"/>
+        <w:ind w:firstLine="709"/>
+      </w:pPr>
+      <w:r>
+        <w:rPr>
+          <w:rFonts w:ascii="Times New Roman" w:hAnsi="Times New Roman" w:eastAsia="Times New Roman"/>
+          <w:b w:val="0"/>
+          <w:i w:val="0"/>
+          <w:sz w:val="28"/>
+        </w:rPr>
+        <w:t>Разделим числитель и знаменатель на x⁷, то есть на старшую степень знаменателя:</w:t>
+      </w:r>
+    </w:p>
+    <w:p>
+      <w:pPr>
+        <w:spacing w:line="360" w:lineRule="auto" w:before="60" w:after="60"/>
+        <w:jc w:val="center"/>
+      </w:pPr>
+      <w:r>
+        <w:rPr>
+          <w:rFonts w:ascii="Times New Roman" w:hAnsi="Times New Roman" w:eastAsia="Times New Roman"/>
+          <w:b w:val="0"/>
+          <w:i w:val="0"/>
+          <w:sz w:val="28"/>
+        </w:rPr>
+        <w:t>(2x⁸ − 3x⁴ − 5x² + 2) / (3x⁷ + 6x⁵ + 4x³ − 3x) =</w:t>
+      </w:r>
+    </w:p>
+    <w:p>
+      <w:pPr>
+        <w:spacing w:line="360" w:lineRule="auto" w:before="60" w:after="60"/>
+        <w:jc w:val="center"/>
+      </w:pPr>
+      <w:r>
+        <w:rPr>
+          <w:rFonts w:ascii="Times New Roman" w:hAnsi="Times New Roman" w:eastAsia="Times New Roman"/>
+          <w:b w:val="0"/>
+          <w:i w:val="0"/>
+          <w:sz w:val="28"/>
+        </w:rPr>
+        <w:t>= (2x − 3/x³ − 5/x⁵ + 2/x⁷) / (3 + 6/x² + 4/x⁴ − 3/x⁶).</w:t>
+      </w:r>
+    </w:p>
+    <w:p>
+      <w:pPr>
+        <w:spacing w:line="360" w:lineRule="auto" w:before="0" w:after="0"/>
+        <w:ind w:firstLine="709"/>
+      </w:pPr>
+      <w:r>
+        <w:rPr>
+          <w:rFonts w:ascii="Times New Roman" w:hAnsi="Times New Roman" w:eastAsia="Times New Roman"/>
+          <w:b w:val="0"/>
+          <w:i w:val="0"/>
+          <w:sz w:val="28"/>
+        </w:rPr>
+        <w:t>Теперь найдем предел полученного выражения. При x → ∞ все дроби вида 1/xⁿ стремятся к нулю:</w:t>
+      </w:r>
+    </w:p>
+    <w:p>
+      <w:pPr>
+        <w:spacing w:line="360" w:lineRule="auto" w:before="60" w:after="60"/>
+        <w:jc w:val="center"/>
+      </w:pPr>
+      <w:r>
+        <w:rPr>
+          <w:rFonts w:ascii="Times New Roman" w:hAnsi="Times New Roman" w:eastAsia="Times New Roman"/>
+          <w:b w:val="0"/>
+          <w:i w:val="0"/>
+          <w:sz w:val="28"/>
+        </w:rPr>
+        <w:t>3/x³ → 0,   5/x⁵ → 0,   2/x⁷ → 0,   6/x² → 0,   4/x⁴ → 0,   3/x⁶ → 0.</w:t>
+      </w:r>
+    </w:p>
+    <w:p>
+      <w:pPr>
+        <w:spacing w:line="360" w:lineRule="auto" w:before="0" w:after="0"/>
+        <w:ind w:firstLine="709"/>
+      </w:pPr>
+      <w:r>
+        <w:rPr>
+          <w:rFonts w:ascii="Times New Roman" w:hAnsi="Times New Roman" w:eastAsia="Times New Roman"/>
+          <w:b w:val="0"/>
+          <w:i w:val="0"/>
+          <w:sz w:val="28"/>
+        </w:rPr>
+        <w:t>Поэтому исходная дробь при больших x ведет себя как выражение:</w:t>
+      </w:r>
+    </w:p>
+    <w:p>
+      <w:pPr>
+        <w:spacing w:line="360" w:lineRule="auto" w:before="60" w:after="60"/>
+        <w:jc w:val="center"/>
+      </w:pPr>
+      <w:r>
+        <w:rPr>
+          <w:rFonts w:ascii="Times New Roman" w:hAnsi="Times New Roman" w:eastAsia="Times New Roman"/>
+          <w:b w:val="0"/>
+          <w:i w:val="0"/>
+          <w:sz w:val="28"/>
+        </w:rPr>
+        <w:t>(2x) / 3.</w:t>
+      </w:r>
+    </w:p>
+    <w:p>
+      <w:pPr>
+        <w:spacing w:line="360" w:lineRule="auto" w:before="0" w:after="0"/>
+        <w:ind w:firstLine="709"/>
+      </w:pPr>
+      <w:r>
+        <w:rPr>
+          <w:rFonts w:ascii="Times New Roman" w:hAnsi="Times New Roman" w:eastAsia="Times New Roman"/>
+          <w:b w:val="0"/>
+          <w:i w:val="0"/>
+          <w:sz w:val="28"/>
+        </w:rPr>
+        <w:t>Так как x стремится к положительной бесконечности, выражение 2x/3 также стремится к положительной бесконечности. Следовательно, предел не является конечным числом.</w:t>
+      </w:r>
+    </w:p>
+    <w:p>
+      <w:pPr>
+        <w:spacing w:line="360" w:lineRule="auto" w:before="0" w:after="0"/>
+        <w:ind w:firstLine="709"/>
+      </w:pPr>
+      <w:r>
+        <w:rPr>
+          <w:rFonts w:ascii="Times New Roman" w:hAnsi="Times New Roman" w:eastAsia="Times New Roman"/>
+          <w:b w:val="0"/>
+          <w:i w:val="0"/>
+          <w:sz w:val="28"/>
+        </w:rPr>
+        <w:t>Итоговое значение предела:</w:t>
+      </w:r>
+    </w:p>
+    <w:p>
+      <w:pPr>
+        <w:spacing w:line="360" w:lineRule="auto" w:before="60" w:after="60"/>
+        <w:jc w:val="center"/>
+      </w:pPr>
+      <w:r>
+        <w:rPr>
+          <w:rFonts w:ascii="Times New Roman" w:hAnsi="Times New Roman" w:eastAsia="Times New Roman"/>
+          <w:b w:val="0"/>
+          <w:i w:val="0"/>
+          <w:sz w:val="28"/>
+        </w:rPr>
+        <w:t>limₓ→∞ (2x⁸ − 3x⁴ − 5x² + 2) / (3x⁷ + 6x⁵ + 4x³ − 3x) = +∞.</w:t>
+      </w:r>
+    </w:p>
+    <w:p>
+      <w:pPr>
+        <w:spacing w:line="360" w:lineRule="auto" w:before="0" w:after="0"/>
+        <w:ind w:firstLine="709"/>
+      </w:pPr>
+      <w:r>
+        <w:rPr>
+          <w:rFonts w:ascii="Times New Roman" w:hAnsi="Times New Roman" w:eastAsia="Times New Roman"/>
+          <w:b/>
+          <w:i w:val="0"/>
+          <w:sz w:val="28"/>
+        </w:rPr>
+        <w:t>Ответ: +∞.</w:t>
+      </w:r>
+    </w:p>
+    <w:p>
+      <w:r>
+        <w:rPr>
+          <w:rFonts w:ascii="Times New Roman" w:hAnsi="Times New Roman" w:eastAsia="Times New Roman"/>
+          <w:sz w:val="28"/>
+        </w:rPr>
+        <w:br w:type="page"/>
+      </w:r>
+    </w:p>
+    <w:p>
+      <w:pPr>
+        <w:spacing w:line="360" w:lineRule="auto" w:before="120" w:after="120"/>
+        <w:jc w:val="center"/>
+      </w:pPr>
+      <w:r>
+        <w:rPr>
+          <w:rFonts w:ascii="Times New Roman" w:hAnsi="Times New Roman" w:eastAsia="Times New Roman"/>
+          <w:b/>
+          <w:i/>
+          <w:sz w:val="28"/>
+        </w:rPr>
+        <w:t>ЗАДАНИЕ 216</w:t>
+      </w:r>
+    </w:p>
+    <w:p>
+      <w:pPr>
+        <w:spacing w:line="360" w:lineRule="auto" w:before="0" w:after="0"/>
+      </w:pPr>
+      <w:r>
+        <w:rPr>
+          <w:rFonts w:ascii="Times New Roman" w:hAnsi="Times New Roman" w:eastAsia="Times New Roman"/>
+          <w:b/>
+          <w:i/>
+          <w:sz w:val="28"/>
+        </w:rPr>
+        <w:t>Решить уравнение.</w:t>
+      </w:r>
+    </w:p>
+    <w:p>
+      <w:pPr>
+        <w:spacing w:line="360" w:lineRule="auto" w:after="120"/>
+        <w:jc w:val="center"/>
       </w:pPr>
       <w:r>
         <w:rPr>
@@ -428,7 +1147,7 @@
         </w:rPr>
         <w:drawing>
           <wp:inline xmlns:a="http://schemas.openxmlformats.org/drawingml/2006/main" xmlns:pic="http://schemas.openxmlformats.org/drawingml/2006/picture">
-            <wp:extent cx="2011680" cy="450376"/>
+            <wp:extent cx="2743200" cy="614149"/>
             <wp:docPr id="2" name="Picture 2"/>
             <wp:cNvGraphicFramePr>
               <a:graphicFrameLocks noChangeAspect="1"/>
@@ -449,7 +1168,7 @@
                   <pic:spPr>
                     <a:xfrm>
                       <a:off x="0" y="0"/>
-                      <a:ext cx="2011680" cy="450376"/>
+                      <a:ext cx="2743200" cy="614149"/>
                     </a:xfrm>
                     <a:prstGeom prst="rect"/>
                   </pic:spPr>
@@ -462,7 +1181,7 @@
     </w:p>
     <w:p>
       <w:pPr>
-        <w:spacing w:line="360" w:lineRule="auto" w:after="120"/>
+        <w:spacing w:line="360" w:lineRule="auto" w:before="120" w:after="120"/>
         <w:jc w:val="center"/>
       </w:pPr>
       <w:r>
@@ -477,22 +1196,7 @@
     </w:p>
     <w:p>
       <w:pPr>
-        <w:spacing w:line="360" w:lineRule="auto" w:after="120"/>
-        <w:jc w:val="center"/>
-      </w:pPr>
-      <w:r>
-        <w:rPr>
-          <w:rFonts w:ascii="Times New Roman" w:hAnsi="Times New Roman" w:eastAsia="Times New Roman"/>
-          <w:b/>
-          <w:i/>
-          <w:sz w:val="28"/>
-        </w:rPr>
-        <w:t>ЗАДАНИЕ 15</w:t>
-      </w:r>
-    </w:p>
-    <w:p>
-      <w:pPr>
-        <w:spacing w:line="360" w:lineRule="auto" w:after="0"/>
+        <w:spacing w:line="360" w:lineRule="auto" w:before="0" w:after="0"/>
         <w:ind w:firstLine="709"/>
       </w:pPr>
       <w:r>
@@ -502,12 +1206,27 @@
           <w:i w:val="0"/>
           <w:sz w:val="28"/>
         </w:rPr>
-        <w:t>Логарифмом положительного числа b по основанию a называется показатель степени, в которую нужно возвести основание a, чтобы получить число b. Обозначается это так: logₐb = x. По определению это равносильно равенству aˣ = b.</w:t>
+        <w:t>Рассмотрим логарифмическое уравнение:</w:t>
       </w:r>
     </w:p>
     <w:p>
       <w:pPr>
-        <w:spacing w:line="360" w:lineRule="auto" w:after="0"/>
+        <w:spacing w:line="360" w:lineRule="auto" w:before="60" w:after="60"/>
+        <w:jc w:val="center"/>
+      </w:pPr>
+      <w:r>
+        <w:rPr>
+          <w:rFonts w:ascii="Times New Roman" w:hAnsi="Times New Roman" w:eastAsia="Times New Roman"/>
+          <w:b w:val="0"/>
+          <w:i w:val="0"/>
+          <w:sz w:val="28"/>
+        </w:rPr>
+        <w:t>log₆₄((x² − 4x + 1) / (6x + 5)) = 1/2.</w:t>
+      </w:r>
+    </w:p>
+    <w:p>
+      <w:pPr>
+        <w:spacing w:line="360" w:lineRule="auto" w:before="0" w:after="0"/>
         <w:ind w:firstLine="709"/>
       </w:pPr>
       <w:r>
@@ -517,12 +1236,27 @@
           <w:i w:val="0"/>
           <w:sz w:val="28"/>
         </w:rPr>
-        <w:t>При этом должны выполняться условия: a &gt; 0, a ≠ 1, b &gt; 0. Основание логарифма не может быть отрицательным, равным нулю или единице, а подлогарифмическое выражение должно быть положительным.</w:t>
+        <w:t>Сначала укажем область допустимых значений. Основание логарифма равно 64, оно положительно и не равно 1, значит условие для основания выполнено. Подлогарифмическое выражение должно быть положительным:</w:t>
       </w:r>
     </w:p>
     <w:p>
       <w:pPr>
-        <w:spacing w:line="360" w:lineRule="auto" w:after="0"/>
+        <w:spacing w:line="360" w:lineRule="auto" w:before="60" w:after="60"/>
+        <w:jc w:val="center"/>
+      </w:pPr>
+      <w:r>
+        <w:rPr>
+          <w:rFonts w:ascii="Times New Roman" w:hAnsi="Times New Roman" w:eastAsia="Times New Roman"/>
+          <w:b w:val="0"/>
+          <w:i w:val="0"/>
+          <w:sz w:val="28"/>
+        </w:rPr>
+        <w:t>(x² − 4x + 1) / (6x + 5) &gt; 0,   6x + 5 ≠ 0.</w:t>
+      </w:r>
+    </w:p>
+    <w:p>
+      <w:pPr>
+        <w:spacing w:line="360" w:lineRule="auto" w:before="0" w:after="0"/>
         <w:ind w:firstLine="709"/>
       </w:pPr>
       <w:r>
@@ -532,12 +1266,27 @@
           <w:i w:val="0"/>
           <w:sz w:val="28"/>
         </w:rPr>
-        <w:t>Основное логарифмическое тождество имеет вид: a^(logₐb) = b, где a &gt; 0, a ≠ 1, b &gt; 0. Оно непосредственно следует из определения логарифма: если logₐb = x, то aˣ = b.</w:t>
+        <w:t>Далее используем определение логарифма: если logₐb = c, то b = aᶜ. В нашем случае a = 64, c = 1/2. Тогда:</w:t>
       </w:r>
     </w:p>
     <w:p>
       <w:pPr>
-        <w:spacing w:line="360" w:lineRule="auto" w:after="0"/>
+        <w:spacing w:line="360" w:lineRule="auto" w:before="60" w:after="60"/>
+        <w:jc w:val="center"/>
+      </w:pPr>
+      <w:r>
+        <w:rPr>
+          <w:rFonts w:ascii="Times New Roman" w:hAnsi="Times New Roman" w:eastAsia="Times New Roman"/>
+          <w:b w:val="0"/>
+          <w:i w:val="0"/>
+          <w:sz w:val="28"/>
+        </w:rPr>
+        <w:t>(x² − 4x + 1) / (6x + 5) = 64^(1/2).</w:t>
+      </w:r>
+    </w:p>
+    <w:p>
+      <w:pPr>
+        <w:spacing w:line="360" w:lineRule="auto" w:before="0" w:after="0"/>
         <w:ind w:firstLine="709"/>
       </w:pPr>
       <w:r>
@@ -547,12 +1296,27 @@
           <w:i w:val="0"/>
           <w:sz w:val="28"/>
         </w:rPr>
-        <w:t>Из определения также следуют важные частные равенства: logₐ1 = 0, так как a⁰ = 1; logₐa = 1, так как a¹ = a; logₐ(aˣ) = x. Эти свойства используются при решении логарифмических уравнений и преобразовании выражений.</w:t>
+        <w:t>Так как 64^(1/2) = √64 = 8, получаем рациональное уравнение:</w:t>
       </w:r>
     </w:p>
     <w:p>
       <w:pPr>
-        <w:spacing w:line="360" w:lineRule="auto" w:after="0"/>
+        <w:spacing w:line="360" w:lineRule="auto" w:before="60" w:after="60"/>
+        <w:jc w:val="center"/>
+      </w:pPr>
+      <w:r>
+        <w:rPr>
+          <w:rFonts w:ascii="Times New Roman" w:hAnsi="Times New Roman" w:eastAsia="Times New Roman"/>
+          <w:b w:val="0"/>
+          <w:i w:val="0"/>
+          <w:sz w:val="28"/>
+        </w:rPr>
+        <w:t>(x² − 4x + 1) / (6x + 5) = 8.</w:t>
+      </w:r>
+    </w:p>
+    <w:p>
+      <w:pPr>
+        <w:spacing w:line="360" w:lineRule="auto" w:before="0" w:after="0"/>
         <w:ind w:firstLine="709"/>
       </w:pPr>
       <w:r>
@@ -562,252 +1326,12 @@
           <w:i w:val="0"/>
           <w:sz w:val="28"/>
         </w:rPr>
-        <w:t>Пример: log₂8 = 3, потому что 2³ = 8. Тогда по основному логарифмическому тождеству 2^(log₂8) = 8.</w:t>
+        <w:t>Умножим обе части уравнения на 6x + 5. При этом необходимо помнить, что 6x + 5 не должно равняться нулю:</w:t>
       </w:r>
     </w:p>
     <w:p>
       <w:pPr>
-        <w:spacing w:line="360" w:lineRule="auto" w:after="120"/>
-        <w:jc w:val="center"/>
-      </w:pPr>
-      <w:r>
-        <w:rPr>
-          <w:rFonts w:ascii="Times New Roman" w:hAnsi="Times New Roman" w:eastAsia="Times New Roman"/>
-          <w:b/>
-          <w:i/>
-          <w:sz w:val="28"/>
-        </w:rPr>
-        <w:t>ЗАДАНИЕ 115</w:t>
-      </w:r>
-    </w:p>
-    <w:p>
-      <w:pPr>
-        <w:spacing w:line="360" w:lineRule="auto" w:after="0"/>
-        <w:ind w:firstLine="709"/>
-      </w:pPr>
-      <w:r>
-        <w:rPr>
-          <w:rFonts w:ascii="Times New Roman" w:hAnsi="Times New Roman" w:eastAsia="Times New Roman"/>
-          <w:b w:val="0"/>
-          <w:i w:val="0"/>
-          <w:sz w:val="28"/>
-        </w:rPr>
-        <w:t>Вычислим предел:</w:t>
-      </w:r>
-    </w:p>
-    <w:p>
-      <w:pPr>
-        <w:spacing w:line="360" w:lineRule="auto" w:after="0"/>
-        <w:jc w:val="center"/>
-      </w:pPr>
-      <w:r>
-        <w:rPr>
-          <w:rFonts w:ascii="Times New Roman" w:hAnsi="Times New Roman" w:eastAsia="Times New Roman"/>
-          <w:b w:val="0"/>
-          <w:i w:val="0"/>
-          <w:sz w:val="28"/>
-        </w:rPr>
-        <w:t>limₓ→∞ (2x⁸ − 3x⁴ − 5x² + 2) / (3x⁷ + 6x⁵ + 4x³ − 3x).</w:t>
-      </w:r>
-    </w:p>
-    <w:p>
-      <w:pPr>
-        <w:spacing w:line="360" w:lineRule="auto" w:after="0"/>
-        <w:ind w:firstLine="709"/>
-      </w:pPr>
-      <w:r>
-        <w:rPr>
-          <w:rFonts w:ascii="Times New Roman" w:hAnsi="Times New Roman" w:eastAsia="Times New Roman"/>
-          <w:b w:val="0"/>
-          <w:i w:val="0"/>
-          <w:sz w:val="28"/>
-        </w:rPr>
-        <w:t>Степень числителя равна 8, степень знаменателя равна 7. При x → ∞ главную роль играют старшие степени многочленов: 2x⁸ в числителе и 3x⁷ в знаменателе.</w:t>
-      </w:r>
-    </w:p>
-    <w:p>
-      <w:pPr>
-        <w:spacing w:line="360" w:lineRule="auto" w:after="0"/>
-        <w:ind w:firstLine="709"/>
-      </w:pPr>
-      <w:r>
-        <w:rPr>
-          <w:rFonts w:ascii="Times New Roman" w:hAnsi="Times New Roman" w:eastAsia="Times New Roman"/>
-          <w:b w:val="0"/>
-          <w:i w:val="0"/>
-          <w:sz w:val="28"/>
-        </w:rPr>
-        <w:t>Разделим числитель и знаменатель на x⁷:</w:t>
-      </w:r>
-    </w:p>
-    <w:p>
-      <w:pPr>
-        <w:spacing w:line="360" w:lineRule="auto" w:after="0"/>
-        <w:jc w:val="center"/>
-      </w:pPr>
-      <w:r>
-        <w:rPr>
-          <w:rFonts w:ascii="Times New Roman" w:hAnsi="Times New Roman" w:eastAsia="Times New Roman"/>
-          <w:b w:val="0"/>
-          <w:i w:val="0"/>
-          <w:sz w:val="28"/>
-        </w:rPr>
-        <w:t>(2x − 3/x³ − 5/x⁵ + 2/x⁷) / (3 + 6/x² + 4/x⁴ − 3/x⁶).</w:t>
-      </w:r>
-    </w:p>
-    <w:p>
-      <w:pPr>
-        <w:spacing w:line="360" w:lineRule="auto" w:after="0"/>
-        <w:ind w:firstLine="709"/>
-      </w:pPr>
-      <w:r>
-        <w:rPr>
-          <w:rFonts w:ascii="Times New Roman" w:hAnsi="Times New Roman" w:eastAsia="Times New Roman"/>
-          <w:b w:val="0"/>
-          <w:i w:val="0"/>
-          <w:sz w:val="28"/>
-        </w:rPr>
-        <w:t>При x → ∞ дроби вида 1/xⁿ стремятся к нулю, поэтому выражение ведет себя как (2x)/3. Следовательно, при x → ∞ значение функции неограниченно возрастает.</w:t>
-      </w:r>
-    </w:p>
-    <w:p>
-      <w:pPr>
-        <w:spacing w:line="360" w:lineRule="auto" w:after="0"/>
-        <w:ind w:firstLine="709"/>
-      </w:pPr>
-      <w:r>
-        <w:rPr>
-          <w:rFonts w:ascii="Times New Roman" w:hAnsi="Times New Roman" w:eastAsia="Times New Roman"/>
-          <w:b w:val="0"/>
-          <w:i w:val="0"/>
-          <w:sz w:val="28"/>
-        </w:rPr>
-        <w:t>Ответ: +∞.</w:t>
-      </w:r>
-    </w:p>
-    <w:p>
-      <w:pPr>
-        <w:spacing w:line="360" w:lineRule="auto" w:after="120"/>
-        <w:jc w:val="center"/>
-      </w:pPr>
-      <w:r>
-        <w:rPr>
-          <w:rFonts w:ascii="Times New Roman" w:hAnsi="Times New Roman" w:eastAsia="Times New Roman"/>
-          <w:b/>
-          <w:i/>
-          <w:sz w:val="28"/>
-        </w:rPr>
-        <w:t>ЗАДАНИЕ 216</w:t>
-      </w:r>
-    </w:p>
-    <w:p>
-      <w:pPr>
-        <w:spacing w:line="360" w:lineRule="auto" w:after="0"/>
-        <w:ind w:firstLine="709"/>
-      </w:pPr>
-      <w:r>
-        <w:rPr>
-          <w:rFonts w:ascii="Times New Roman" w:hAnsi="Times New Roman" w:eastAsia="Times New Roman"/>
-          <w:b w:val="0"/>
-          <w:i w:val="0"/>
-          <w:sz w:val="28"/>
-        </w:rPr>
-        <w:t>Решим уравнение:</w:t>
-      </w:r>
-    </w:p>
-    <w:p>
-      <w:pPr>
-        <w:spacing w:line="360" w:lineRule="auto" w:after="0"/>
-        <w:jc w:val="center"/>
-      </w:pPr>
-      <w:r>
-        <w:rPr>
-          <w:rFonts w:ascii="Times New Roman" w:hAnsi="Times New Roman" w:eastAsia="Times New Roman"/>
-          <w:b w:val="0"/>
-          <w:i w:val="0"/>
-          <w:sz w:val="28"/>
-        </w:rPr>
-        <w:t>log₆₄((x² − 4x + 1)/(6x + 5)) = 1/2.</w:t>
-      </w:r>
-    </w:p>
-    <w:p>
-      <w:pPr>
-        <w:spacing w:line="360" w:lineRule="auto" w:after="0"/>
-        <w:ind w:firstLine="709"/>
-      </w:pPr>
-      <w:r>
-        <w:rPr>
-          <w:rFonts w:ascii="Times New Roman" w:hAnsi="Times New Roman" w:eastAsia="Times New Roman"/>
-          <w:b w:val="0"/>
-          <w:i w:val="0"/>
-          <w:sz w:val="28"/>
-        </w:rPr>
-        <w:t>По определению логарифма получаем:</w:t>
-      </w:r>
-    </w:p>
-    <w:p>
-      <w:pPr>
-        <w:spacing w:line="360" w:lineRule="auto" w:after="0"/>
-        <w:jc w:val="center"/>
-      </w:pPr>
-      <w:r>
-        <w:rPr>
-          <w:rFonts w:ascii="Times New Roman" w:hAnsi="Times New Roman" w:eastAsia="Times New Roman"/>
-          <w:b w:val="0"/>
-          <w:i w:val="0"/>
-          <w:sz w:val="28"/>
-        </w:rPr>
-        <w:t>(x² − 4x + 1)/(6x + 5) = 64^(1/2).</w:t>
-      </w:r>
-    </w:p>
-    <w:p>
-      <w:pPr>
-        <w:spacing w:line="360" w:lineRule="auto" w:after="0"/>
-        <w:ind w:firstLine="709"/>
-      </w:pPr>
-      <w:r>
-        <w:rPr>
-          <w:rFonts w:ascii="Times New Roman" w:hAnsi="Times New Roman" w:eastAsia="Times New Roman"/>
-          <w:b w:val="0"/>
-          <w:i w:val="0"/>
-          <w:sz w:val="28"/>
-        </w:rPr>
-        <w:t>Так как 64^(1/2) = √64 = 8, имеем:</w:t>
-      </w:r>
-    </w:p>
-    <w:p>
-      <w:pPr>
-        <w:spacing w:line="360" w:lineRule="auto" w:after="0"/>
-        <w:jc w:val="center"/>
-      </w:pPr>
-      <w:r>
-        <w:rPr>
-          <w:rFonts w:ascii="Times New Roman" w:hAnsi="Times New Roman" w:eastAsia="Times New Roman"/>
-          <w:b w:val="0"/>
-          <w:i w:val="0"/>
-          <w:sz w:val="28"/>
-        </w:rPr>
-        <w:t>(x² − 4x + 1)/(6x + 5) = 8.</w:t>
-      </w:r>
-    </w:p>
-    <w:p>
-      <w:pPr>
-        <w:spacing w:line="360" w:lineRule="auto" w:after="0"/>
-        <w:ind w:firstLine="709"/>
-      </w:pPr>
-      <w:r>
-        <w:rPr>
-          <w:rFonts w:ascii="Times New Roman" w:hAnsi="Times New Roman" w:eastAsia="Times New Roman"/>
-          <w:b w:val="0"/>
-          <w:i w:val="0"/>
-          <w:sz w:val="28"/>
-        </w:rPr>
-        <w:t>Умножим обе части равенства на 6x + 5:</w:t>
-      </w:r>
-    </w:p>
-    <w:p>
-      <w:pPr>
-        <w:spacing w:line="360" w:lineRule="auto" w:after="0"/>
+        <w:spacing w:line="360" w:lineRule="auto" w:before="60" w:after="60"/>
         <w:jc w:val="center"/>
       </w:pPr>
       <w:r>
@@ -822,7 +1346,7 @@
     </w:p>
     <w:p>
       <w:pPr>
-        <w:spacing w:line="360" w:lineRule="auto" w:after="0"/>
+        <w:spacing w:line="360" w:lineRule="auto" w:before="0" w:after="0"/>
         <w:ind w:firstLine="709"/>
       </w:pPr>
       <w:r>
@@ -832,12 +1356,12 @@
           <w:i w:val="0"/>
           <w:sz w:val="28"/>
         </w:rPr>
-        <w:t>Раскроем скобки и перенесем все слагаемые в левую часть:</w:t>
+        <w:t>Раскроем скобки в правой части:</w:t>
       </w:r>
     </w:p>
     <w:p>
       <w:pPr>
-        <w:spacing w:line="360" w:lineRule="auto" w:after="0"/>
+        <w:spacing w:line="360" w:lineRule="auto" w:before="60" w:after="60"/>
         <w:jc w:val="center"/>
       </w:pPr>
       <w:r>
@@ -847,12 +1371,42 @@
           <w:i w:val="0"/>
           <w:sz w:val="28"/>
         </w:rPr>
-        <w:t>x² − 4x + 1 = 48x + 40;</w:t>
+        <w:t>x² − 4x + 1 = 48x + 40.</w:t>
       </w:r>
     </w:p>
     <w:p>
       <w:pPr>
-        <w:spacing w:line="360" w:lineRule="auto" w:after="0"/>
+        <w:spacing w:line="360" w:lineRule="auto" w:before="0" w:after="0"/>
+        <w:ind w:firstLine="709"/>
+      </w:pPr>
+      <w:r>
+        <w:rPr>
+          <w:rFonts w:ascii="Times New Roman" w:hAnsi="Times New Roman" w:eastAsia="Times New Roman"/>
+          <w:b w:val="0"/>
+          <w:i w:val="0"/>
+          <w:sz w:val="28"/>
+        </w:rPr>
+        <w:t>Перенесем все слагаемые в левую часть и приведем подобные слагаемые:</w:t>
+      </w:r>
+    </w:p>
+    <w:p>
+      <w:pPr>
+        <w:spacing w:line="360" w:lineRule="auto" w:before="60" w:after="60"/>
+        <w:jc w:val="center"/>
+      </w:pPr>
+      <w:r>
+        <w:rPr>
+          <w:rFonts w:ascii="Times New Roman" w:hAnsi="Times New Roman" w:eastAsia="Times New Roman"/>
+          <w:b w:val="0"/>
+          <w:i w:val="0"/>
+          <w:sz w:val="28"/>
+        </w:rPr>
+        <w:t>x² − 4x − 48x + 1 − 40 = 0,</w:t>
+      </w:r>
+    </w:p>
+    <w:p>
+      <w:pPr>
+        <w:spacing w:line="360" w:lineRule="auto" w:before="60" w:after="60"/>
         <w:jc w:val="center"/>
       </w:pPr>
       <w:r>
@@ -867,7 +1421,7 @@
     </w:p>
     <w:p>
       <w:pPr>
-        <w:spacing w:line="360" w:lineRule="auto" w:after="0"/>
+        <w:spacing w:line="360" w:lineRule="auto" w:before="0" w:after="0"/>
         <w:ind w:firstLine="709"/>
       </w:pPr>
       <w:r>
@@ -877,12 +1431,12 @@
           <w:i w:val="0"/>
           <w:sz w:val="28"/>
         </w:rPr>
-        <w:t>Найдем дискриминант:</w:t>
+        <w:t>Получили квадратное уравнение. Найдем его дискриминант:</w:t>
       </w:r>
     </w:p>
     <w:p>
       <w:pPr>
-        <w:spacing w:line="360" w:lineRule="auto" w:after="0"/>
+        <w:spacing w:line="360" w:lineRule="auto" w:before="60" w:after="60"/>
         <w:jc w:val="center"/>
       </w:pPr>
       <w:r>
@@ -892,12 +1446,27 @@
           <w:i w:val="0"/>
           <w:sz w:val="28"/>
         </w:rPr>
-        <w:t>D = (−52)² − 4 · 1 · (−39) = 2704 + 156 = 2860 = 4 · 715.</w:t>
+        <w:t>D = b² − 4ac = (−52)² − 4 · 1 · (−39).</w:t>
       </w:r>
     </w:p>
     <w:p>
       <w:pPr>
-        <w:spacing w:line="360" w:lineRule="auto" w:after="0"/>
+        <w:spacing w:line="360" w:lineRule="auto" w:before="60" w:after="60"/>
+        <w:jc w:val="center"/>
+      </w:pPr>
+      <w:r>
+        <w:rPr>
+          <w:rFonts w:ascii="Times New Roman" w:hAnsi="Times New Roman" w:eastAsia="Times New Roman"/>
+          <w:b w:val="0"/>
+          <w:i w:val="0"/>
+          <w:sz w:val="28"/>
+        </w:rPr>
+        <w:t>D = 2704 + 156 = 2860.</w:t>
+      </w:r>
+    </w:p>
+    <w:p>
+      <w:pPr>
+        <w:spacing w:line="360" w:lineRule="auto" w:before="0" w:after="0"/>
         <w:ind w:firstLine="709"/>
       </w:pPr>
       <w:r>
@@ -907,12 +1476,42 @@
           <w:i w:val="0"/>
           <w:sz w:val="28"/>
         </w:rPr>
-        <w:t>Тогда корни уравнения равны:</w:t>
+        <w:t>Упростим корень из дискриминанта:</w:t>
       </w:r>
     </w:p>
     <w:p>
       <w:pPr>
-        <w:spacing w:line="360" w:lineRule="auto" w:after="0"/>
+        <w:spacing w:line="360" w:lineRule="auto" w:before="60" w:after="60"/>
+        <w:jc w:val="center"/>
+      </w:pPr>
+      <w:r>
+        <w:rPr>
+          <w:rFonts w:ascii="Times New Roman" w:hAnsi="Times New Roman" w:eastAsia="Times New Roman"/>
+          <w:b w:val="0"/>
+          <w:i w:val="0"/>
+          <w:sz w:val="28"/>
+        </w:rPr>
+        <w:t>√2860 = √(4 · 715) = 2√715.</w:t>
+      </w:r>
+    </w:p>
+    <w:p>
+      <w:pPr>
+        <w:spacing w:line="360" w:lineRule="auto" w:before="0" w:after="0"/>
+        <w:ind w:firstLine="709"/>
+      </w:pPr>
+      <w:r>
+        <w:rPr>
+          <w:rFonts w:ascii="Times New Roman" w:hAnsi="Times New Roman" w:eastAsia="Times New Roman"/>
+          <w:b w:val="0"/>
+          <w:i w:val="0"/>
+          <w:sz w:val="28"/>
+        </w:rPr>
+        <w:t>Найдем корни квадратного уравнения:</w:t>
+      </w:r>
+    </w:p>
+    <w:p>
+      <w:pPr>
+        <w:spacing w:line="360" w:lineRule="auto" w:before="60" w:after="60"/>
         <w:jc w:val="center"/>
       </w:pPr>
       <w:r>
@@ -927,7 +1526,7 @@
     </w:p>
     <w:p>
       <w:pPr>
-        <w:spacing w:line="360" w:lineRule="auto" w:after="0"/>
+        <w:spacing w:line="360" w:lineRule="auto" w:before="0" w:after="0"/>
         <w:ind w:firstLine="709"/>
       </w:pPr>
       <w:r>
@@ -937,12 +1536,27 @@
           <w:i w:val="0"/>
           <w:sz w:val="28"/>
         </w:rPr>
-        <w:t>Проверим область допустимых значений: 6x + 5 ≠ 0, а подлогарифмическое выражение должно быть положительным. Для найденных корней дробь равна 8, то есть положительна, поэтому оба корня подходят.</w:t>
+        <w:t>Получаем два возможных значения:</w:t>
       </w:r>
     </w:p>
     <w:p>
       <w:pPr>
-        <w:spacing w:line="360" w:lineRule="auto" w:after="0"/>
+        <w:spacing w:line="360" w:lineRule="auto" w:before="60" w:after="60"/>
+        <w:jc w:val="center"/>
+      </w:pPr>
+      <w:r>
+        <w:rPr>
+          <w:rFonts w:ascii="Times New Roman" w:hAnsi="Times New Roman" w:eastAsia="Times New Roman"/>
+          <w:b w:val="0"/>
+          <w:i w:val="0"/>
+          <w:sz w:val="28"/>
+        </w:rPr>
+        <w:t>x₁ = 26 − √715,   x₂ = 26 + √715.</w:t>
+      </w:r>
+    </w:p>
+    <w:p>
+      <w:pPr>
+        <w:spacing w:line="360" w:lineRule="auto" w:before="0" w:after="0"/>
         <w:ind w:firstLine="709"/>
       </w:pPr>
       <w:r>
@@ -952,12 +1566,51 @@
           <w:i w:val="0"/>
           <w:sz w:val="28"/>
         </w:rPr>
+        <w:t>Проверим найденные корни. Из преобразованного уравнения следует, что для каждого найденного корня подлогарифмическое выражение равно 8. Число 8 положительно, значит условие положительности подлогарифмического выражения выполняется. Кроме того, найденные значения не обращают знаменатель 6x + 5 в ноль.</w:t>
+      </w:r>
+    </w:p>
+    <w:p>
+      <w:pPr>
+        <w:spacing w:line="360" w:lineRule="auto" w:before="0" w:after="0"/>
+        <w:ind w:firstLine="709"/>
+      </w:pPr>
+      <w:r>
+        <w:rPr>
+          <w:rFonts w:ascii="Times New Roman" w:hAnsi="Times New Roman" w:eastAsia="Times New Roman"/>
+          <w:b w:val="0"/>
+          <w:i w:val="0"/>
+          <w:sz w:val="28"/>
+        </w:rPr>
+        <w:t>Следовательно, оба корня удовлетворяют исходному логарифмическому уравнению.</w:t>
+      </w:r>
+    </w:p>
+    <w:p>
+      <w:pPr>
+        <w:spacing w:line="360" w:lineRule="auto" w:before="0" w:after="0"/>
+        <w:ind w:firstLine="709"/>
+      </w:pPr>
+      <w:r>
+        <w:rPr>
+          <w:rFonts w:ascii="Times New Roman" w:hAnsi="Times New Roman" w:eastAsia="Times New Roman"/>
+          <w:b/>
+          <w:i w:val="0"/>
+          <w:sz w:val="28"/>
+        </w:rPr>
         <w:t>Ответ: x₁ = 26 − √715, x₂ = 26 + √715.</w:t>
       </w:r>
     </w:p>
     <w:p>
+      <w:r>
+        <w:rPr>
+          <w:rFonts w:ascii="Times New Roman" w:hAnsi="Times New Roman" w:eastAsia="Times New Roman"/>
+          <w:sz w:val="28"/>
+        </w:rPr>
+        <w:br w:type="page"/>
+      </w:r>
+    </w:p>
+    <w:p>
       <w:pPr>
-        <w:spacing w:line="360" w:lineRule="auto" w:after="120"/>
+        <w:spacing w:line="360" w:lineRule="auto" w:before="120" w:after="120"/>
         <w:jc w:val="center"/>
       </w:pPr>
       <w:r>
@@ -972,7 +1625,7 @@
     </w:p>
     <w:p>
       <w:pPr>
-        <w:spacing w:line="360" w:lineRule="auto" w:after="0"/>
+        <w:spacing w:line="360" w:lineRule="auto" w:before="0" w:after="0"/>
       </w:pPr>
       <w:r>
         <w:rPr>
@@ -981,12 +1634,12 @@
           <w:i w:val="0"/>
           <w:sz w:val="28"/>
         </w:rPr>
-        <w:t>1. Богомолов Н. В. Практические занятия по математике: учебное пособие для среднего профессионального образования. — М.: Юрайт, 2024.</w:t>
+        <w:t>1. Башмаков М. И. Математика: учебник для учреждений среднего профессионального образования. — М.: Академия, 2023.</w:t>
       </w:r>
     </w:p>
     <w:p>
       <w:pPr>
-        <w:spacing w:line="360" w:lineRule="auto" w:after="0"/>
+        <w:spacing w:line="360" w:lineRule="auto" w:before="0" w:after="0"/>
       </w:pPr>
       <w:r>
         <w:rPr>
@@ -995,12 +1648,12 @@
           <w:i w:val="0"/>
           <w:sz w:val="28"/>
         </w:rPr>
-        <w:t>2. Башмаков М. И. Математика: учебник для учреждений среднего профессионального образования. — М.: Академия, 2023.</w:t>
+        <w:t>2. Богомолов Н. В. Практические занятия по математике: учебное пособие для среднего профессионального образования. — М.: Юрайт, 2024.</w:t>
       </w:r>
     </w:p>
     <w:p>
       <w:pPr>
-        <w:spacing w:line="360" w:lineRule="auto" w:after="0"/>
+        <w:spacing w:line="360" w:lineRule="auto" w:before="0" w:after="0"/>
       </w:pPr>
       <w:r>
         <w:rPr>
@@ -1014,7 +1667,7 @@
     </w:p>
     <w:p>
       <w:pPr>
-        <w:spacing w:line="360" w:lineRule="auto" w:after="0"/>
+        <w:spacing w:line="360" w:lineRule="auto" w:before="0" w:after="0"/>
       </w:pPr>
       <w:r>
         <w:rPr>
@@ -1027,7 +1680,7 @@
     </w:p>
     <w:p>
       <w:pPr>
-        <w:spacing w:line="360" w:lineRule="auto" w:after="0"/>
+        <w:spacing w:line="360" w:lineRule="auto" w:before="0" w:after="0"/>
       </w:pPr>
       <w:r>
         <w:rPr>
@@ -1041,7 +1694,7 @@
     </w:p>
     <w:p>
       <w:pPr>
-        <w:spacing w:line="360" w:lineRule="auto" w:after="0"/>
+        <w:spacing w:line="360" w:lineRule="auto" w:before="0" w:after="0"/>
       </w:pPr>
       <w:r>
         <w:rPr>
@@ -1072,6 +1725,10 @@
       <w:jc w:val="right"/>
     </w:pPr>
     <w:r>
+      <w:rPr>
+        <w:rFonts w:ascii="Times New Roman" w:hAnsi="Times New Roman" w:eastAsia="Times New Roman"/>
+        <w:sz w:val="28"/>
+      </w:rPr>
       <w:fldChar w:fldCharType="begin"/>
       <w:instrText xml:space="preserve"> PAGE </w:instrText>
       <w:fldChar w:fldCharType="end"/>

</xml_diff>